<commit_message>
Updated analysis, made technical details doc, added different background, fixed hitboxes, made a game over screen and func about it, made a validation table, still empty
</commit_message>
<xml_diff>
--- a/doc/analysis/analysis.docx
+++ b/doc/analysis/analysis.docx
@@ -275,7 +275,7 @@
             <w:rPr/>
             <w:t>4.1 Functional Requirements and MoSCoW Prioritisation</w:t>
             <w:tab/>
-            <w:t>3</w:t>
+            <w:t>4</w:t>
           </w:r>
         </w:p>
         <w:p>
@@ -307,7 +307,7 @@
             <w:rPr/>
             <w:t>5. Target audience</w:t>
             <w:tab/>
-            <w:t>4</w:t>
+            <w:t>5</w:t>
           </w:r>
         </w:p>
         <w:p>
@@ -325,6 +325,22 @@
             <w:tab/>
             <w:t>5</w:t>
           </w:r>
+        </w:p>
+        <w:p>
+          <w:pPr>
+            <w:pStyle w:val="TOC1"/>
+            <w:tabs>
+              <w:tab w:val="clear" w:pos="9972"/>
+              <w:tab w:val="right" w:pos="9971" w:leader="dot"/>
+            </w:tabs>
+            <w:rPr/>
+          </w:pPr>
+          <w:r>
+            <w:rPr/>
+            <w:t>7. Technical Details</w:t>
+            <w:tab/>
+            <w:t>5</w:t>
+          </w:r>
           <w:r>
             <w:rPr/>
             <w:fldChar w:fldCharType="end"/>
@@ -421,15 +437,7 @@
           <w:sz w:val="24"/>
           <w:szCs w:val="24"/>
         </w:rPr>
-        <w:t>The gameplay consists of a player controlling a ship in order to survive increasingly difficult waves of asteroids coming towards him while collecting upgrades/rewards and achieving the highest possible score. T</w:t>
-      </w:r>
-      <w:r>
-        <w:rPr>
-          <w:sz w:val="24"/>
-          <w:szCs w:val="24"/>
-          <w:u w:val="single"/>
-        </w:rPr>
-        <w:t>hese rewards make it possible to buy/use a new ship, while the upgrades are temporary to the current run.</w:t>
+        <w:t xml:space="preserve">The gameplay consists of a player controlling a ship in order to survive increasingly difficult waves of asteroids coming towards him while collecting upgrades/rewards and achieving the highest possible score. </w:t>
       </w:r>
     </w:p>
     <w:p>
@@ -665,7 +673,7 @@
           <w:tcPr>
             <w:tcW w:w="4896" w:type="dxa"/>
             <w:tcBorders/>
-            <w:shd w:fill="FF8000" w:val="clear"/>
+            <w:shd w:fill="EEEEEE" w:val="clear"/>
             <w:vAlign w:val="center"/>
           </w:tcPr>
           <w:p>
@@ -697,31 +705,31 @@
           <w:tcPr>
             <w:tcW w:w="4896" w:type="dxa"/>
             <w:tcBorders/>
-            <w:shd w:fill="FF8000" w:val="clear"/>
-            <w:vAlign w:val="center"/>
-          </w:tcPr>
-          <w:p>
-            <w:pPr>
-              <w:pStyle w:val="Normal"/>
-              <w:widowControl/>
-              <w:spacing w:before="0" w:after="0"/>
-              <w:jc w:val="start"/>
-              <w:rPr>
-                <w:rFonts w:eastAsia="ＭＳ 明朝" w:cs=""/>
-                <w:kern w:val="0"/>
-                <w:szCs w:val="22"/>
-                <w:lang w:val="en-US" w:eastAsia="en-US" w:bidi="ar-SA"/>
-              </w:rPr>
-            </w:pPr>
-            <w:r>
-              <w:rPr>
-                <w:rFonts w:eastAsia="ＭＳ 明朝" w:cs="" w:ascii="Aptos" w:hAnsi="Aptos"/>
-                <w:kern w:val="0"/>
-                <w:sz w:val="18"/>
-                <w:szCs w:val="22"/>
-                <w:lang w:val="en-US" w:eastAsia="en-US" w:bidi="ar-SA"/>
-              </w:rPr>
-              <w:t>The project is successful when the Must-have requirements are implemented and can be validated through gameplay testing.</w:t>
+            <w:shd w:fill="EEEEEE" w:val="clear"/>
+            <w:vAlign w:val="center"/>
+          </w:tcPr>
+          <w:p>
+            <w:pPr>
+              <w:pStyle w:val="Normal"/>
+              <w:widowControl/>
+              <w:spacing w:before="0" w:after="0"/>
+              <w:jc w:val="start"/>
+              <w:rPr>
+                <w:rFonts w:eastAsia="ＭＳ 明朝" w:cs=""/>
+                <w:kern w:val="0"/>
+                <w:szCs w:val="22"/>
+                <w:lang w:val="en-US" w:eastAsia="en-US" w:bidi="ar-SA"/>
+              </w:rPr>
+            </w:pPr>
+            <w:r>
+              <w:rPr>
+                <w:rFonts w:eastAsia="ＭＳ 明朝" w:cs="" w:ascii="Aptos" w:hAnsi="Aptos"/>
+                <w:kern w:val="0"/>
+                <w:sz w:val="18"/>
+                <w:szCs w:val="22"/>
+                <w:lang w:val="en-US" w:eastAsia="en-US" w:bidi="ar-SA"/>
+              </w:rPr>
+              <w:t xml:space="preserve">The project is successful when a first-time player can complete one full gameplay loop. The gameplay loop consists of: starting a run, controling the ship, avoiding and shooting asteroids, seeing the score change, losing when hit, restarting/closing the game. </w:t>
             </w:r>
           </w:p>
         </w:tc>
@@ -1241,30 +1249,6 @@
     </w:p>
     <w:p>
       <w:pPr>
-        <w:pStyle w:val="ListBullet"/>
-        <w:numPr>
-          <w:ilvl w:val="0"/>
-          <w:numId w:val="2"/>
-        </w:numPr>
-        <w:rPr/>
-      </w:pPr>
-      <w:r>
-        <w:rPr/>
-        <w:t xml:space="preserve">A basic menu and audio/settings </w:t>
-      </w:r>
-      <w:r>
-        <w:rPr>
-          <w:u w:val="single"/>
-        </w:rPr>
-        <w:t>features if enough time remains</w:t>
-      </w:r>
-      <w:r>
-        <w:rPr/>
-        <w:t>.</w:t>
-      </w:r>
-    </w:p>
-    <w:p>
-      <w:pPr>
         <w:pStyle w:val="Heading2"/>
         <w:rPr/>
       </w:pPr>
@@ -1434,7 +1418,7 @@
       </w:pPr>
       <w:r>
         <w:rPr/>
-        <w:t>The requirements are written so that they can later be validated. MoSCoW prioritisation is used.</w:t>
+        <w:t>The requirements are written in a priority order, MoSCoW prioritisation is used.</w:t>
       </w:r>
     </w:p>
     <w:p>
@@ -1831,16 +1815,16 @@
               <w:spacing w:before="0" w:after="0"/>
               <w:jc w:val="start"/>
               <w:rPr>
-                <w:u w:val="single"/>
-              </w:rPr>
-            </w:pPr>
-            <w:r>
-              <w:rPr>
-                <w:rFonts w:eastAsia="ＭＳ 明朝" w:cs="" w:ascii="Aptos" w:hAnsi="Aptos"/>
-                <w:kern w:val="0"/>
-                <w:sz w:val="18"/>
-                <w:szCs w:val="22"/>
-                <w:u w:val="single"/>
+                <w:u w:val="none"/>
+              </w:rPr>
+            </w:pPr>
+            <w:r>
+              <w:rPr>
+                <w:rFonts w:eastAsia="ＭＳ 明朝" w:cs="" w:ascii="Aptos" w:hAnsi="Aptos"/>
+                <w:kern w:val="0"/>
+                <w:sz w:val="18"/>
+                <w:szCs w:val="22"/>
+                <w:u w:val="none"/>
                 <w:lang w:val="en-US" w:eastAsia="en-US" w:bidi="ar-SA"/>
               </w:rPr>
               <w:t>Collision detection between different structures</w:t>
@@ -2115,7 +2099,7 @@
                 <w:szCs w:val="22"/>
                 <w:lang w:val="en-US" w:eastAsia="en-US" w:bidi="ar-SA"/>
               </w:rPr>
-              <w:t>Asteroids should become faster with time.</w:t>
+              <w:t>Asteroids should become faster when the socre is higher.</w:t>
             </w:r>
           </w:p>
         </w:tc>
@@ -2159,31 +2143,27 @@
           <w:tcPr>
             <w:tcW w:w="6528" w:type="dxa"/>
             <w:tcBorders/>
-            <w:shd w:fill="F7F9FC" w:val="clear"/>
-            <w:vAlign w:val="center"/>
-          </w:tcPr>
-          <w:p>
-            <w:pPr>
-              <w:pStyle w:val="Normal"/>
-              <w:widowControl/>
-              <w:spacing w:before="0" w:after="0"/>
-              <w:jc w:val="start"/>
-              <w:rPr>
-                <w:rFonts w:eastAsia="ＭＳ 明朝" w:cs=""/>
-                <w:kern w:val="0"/>
-                <w:szCs w:val="22"/>
-                <w:lang w:val="en-US" w:eastAsia="en-US" w:bidi="ar-SA"/>
-              </w:rPr>
-            </w:pPr>
-            <w:r>
-              <w:rPr>
-                <w:rFonts w:eastAsia="ＭＳ 明朝" w:cs="" w:ascii="Aptos" w:hAnsi="Aptos"/>
-                <w:kern w:val="0"/>
-                <w:sz w:val="18"/>
-                <w:szCs w:val="22"/>
-                <w:lang w:val="en-US" w:eastAsia="en-US" w:bidi="ar-SA"/>
-              </w:rPr>
-              <w:t>Temporary upgrades or rewards should appear during gameplay.</w:t>
+            <w:vAlign w:val="center"/>
+          </w:tcPr>
+          <w:p>
+            <w:pPr>
+              <w:pStyle w:val="Normal"/>
+              <w:widowControl/>
+              <w:spacing w:before="0" w:after="0"/>
+              <w:jc w:val="start"/>
+              <w:rPr>
+                <w:rFonts w:eastAsia="ＭＳ 明朝" w:cs=""/>
+                <w:kern w:val="0"/>
+                <w:szCs w:val="22"/>
+                <w:lang w:val="en-US" w:eastAsia="en-US" w:bidi="ar-SA"/>
+              </w:rPr>
+            </w:pPr>
+            <w:r>
+              <w:rPr>
+                <w:rFonts w:ascii="Aptos" w:hAnsi="Aptos"/>
+                <w:sz w:val="18"/>
+              </w:rPr>
+              <w:t>Game Over Menu showing Score and Highscore</w:t>
             </w:r>
           </w:p>
         </w:tc>
@@ -2191,31 +2171,27 @@
           <w:tcPr>
             <w:tcW w:w="3264" w:type="dxa"/>
             <w:tcBorders/>
-            <w:shd w:fill="F7F9FC" w:val="clear"/>
-            <w:vAlign w:val="center"/>
-          </w:tcPr>
-          <w:p>
-            <w:pPr>
-              <w:pStyle w:val="Normal"/>
-              <w:widowControl/>
-              <w:spacing w:before="0" w:after="0"/>
-              <w:jc w:val="start"/>
-              <w:rPr>
-                <w:rFonts w:eastAsia="ＭＳ 明朝" w:cs=""/>
-                <w:kern w:val="0"/>
-                <w:szCs w:val="22"/>
-                <w:lang w:val="en-US" w:eastAsia="en-US" w:bidi="ar-SA"/>
-              </w:rPr>
-            </w:pPr>
-            <w:r>
-              <w:rPr>
-                <w:rFonts w:eastAsia="ＭＳ 明朝" w:cs="" w:ascii="Aptos" w:hAnsi="Aptos"/>
-                <w:kern w:val="0"/>
-                <w:sz w:val="18"/>
-                <w:szCs w:val="22"/>
-                <w:lang w:val="en-US" w:eastAsia="en-US" w:bidi="ar-SA"/>
-              </w:rPr>
-              <w:t>Should/Must</w:t>
+            <w:vAlign w:val="center"/>
+          </w:tcPr>
+          <w:p>
+            <w:pPr>
+              <w:pStyle w:val="Normal"/>
+              <w:widowControl/>
+              <w:spacing w:before="0" w:after="0"/>
+              <w:jc w:val="start"/>
+              <w:rPr>
+                <w:rFonts w:eastAsia="ＭＳ 明朝" w:cs=""/>
+                <w:kern w:val="0"/>
+                <w:szCs w:val="22"/>
+                <w:lang w:val="en-US" w:eastAsia="en-US" w:bidi="ar-SA"/>
+              </w:rPr>
+            </w:pPr>
+            <w:r>
+              <w:rPr>
+                <w:rFonts w:ascii="Aptos" w:hAnsi="Aptos"/>
+                <w:sz w:val="18"/>
+              </w:rPr>
+              <w:t>Should</w:t>
             </w:r>
           </w:p>
         </w:tc>
@@ -2228,30 +2204,31 @@
           <w:tcPr>
             <w:tcW w:w="6528" w:type="dxa"/>
             <w:tcBorders/>
-            <w:vAlign w:val="center"/>
-          </w:tcPr>
-          <w:p>
-            <w:pPr>
-              <w:pStyle w:val="Normal"/>
-              <w:widowControl/>
-              <w:spacing w:before="0" w:after="0"/>
-              <w:jc w:val="start"/>
-              <w:rPr>
-                <w:rFonts w:eastAsia="ＭＳ 明朝" w:cs=""/>
-                <w:kern w:val="0"/>
-                <w:szCs w:val="22"/>
-                <w:lang w:val="en-US" w:eastAsia="en-US" w:bidi="ar-SA"/>
-              </w:rPr>
-            </w:pPr>
-            <w:r>
-              <w:rPr>
-                <w:rFonts w:eastAsia="ＭＳ 明朝" w:cs="" w:ascii="Aptos" w:hAnsi="Aptos"/>
-                <w:kern w:val="0"/>
-                <w:sz w:val="18"/>
-                <w:szCs w:val="22"/>
-                <w:lang w:val="en-US" w:eastAsia="en-US" w:bidi="ar-SA"/>
-              </w:rPr>
-              <w:t>The game should contain variation in asteroid behaviour, durability, speed or appearance.</w:t>
+            <w:shd w:fill="F7F9FC" w:val="clear"/>
+            <w:vAlign w:val="center"/>
+          </w:tcPr>
+          <w:p>
+            <w:pPr>
+              <w:pStyle w:val="Normal"/>
+              <w:widowControl/>
+              <w:spacing w:before="0" w:after="0"/>
+              <w:jc w:val="start"/>
+              <w:rPr>
+                <w:rFonts w:eastAsia="ＭＳ 明朝" w:cs=""/>
+                <w:kern w:val="0"/>
+                <w:szCs w:val="22"/>
+                <w:lang w:val="en-US" w:eastAsia="en-US" w:bidi="ar-SA"/>
+              </w:rPr>
+            </w:pPr>
+            <w:r>
+              <w:rPr>
+                <w:rFonts w:eastAsia="ＭＳ 明朝" w:cs="" w:ascii="Aptos" w:hAnsi="Aptos"/>
+                <w:kern w:val="0"/>
+                <w:sz w:val="18"/>
+                <w:szCs w:val="22"/>
+                <w:lang w:val="en-US" w:eastAsia="en-US" w:bidi="ar-SA"/>
+              </w:rPr>
+              <w:t>Temporary upgrades or rewards should appear during gameplay.</w:t>
             </w:r>
           </w:p>
         </w:tc>
@@ -2259,6 +2236,7 @@
           <w:tcPr>
             <w:tcW w:w="3264" w:type="dxa"/>
             <w:tcBorders/>
+            <w:shd w:fill="F7F9FC" w:val="clear"/>
             <w:vAlign w:val="center"/>
           </w:tcPr>
           <w:p>
@@ -2295,31 +2273,30 @@
           <w:tcPr>
             <w:tcW w:w="6528" w:type="dxa"/>
             <w:tcBorders/>
-            <w:shd w:fill="F7F9FC" w:val="clear"/>
-            <w:vAlign w:val="center"/>
-          </w:tcPr>
-          <w:p>
-            <w:pPr>
-              <w:pStyle w:val="Normal"/>
-              <w:widowControl/>
-              <w:spacing w:before="0" w:after="0"/>
-              <w:jc w:val="start"/>
-              <w:rPr>
-                <w:rFonts w:eastAsia="ＭＳ 明朝" w:cs=""/>
-                <w:kern w:val="0"/>
-                <w:szCs w:val="22"/>
-                <w:lang w:val="en-US" w:eastAsia="en-US" w:bidi="ar-SA"/>
-              </w:rPr>
-            </w:pPr>
-            <w:r>
-              <w:rPr>
-                <w:rFonts w:eastAsia="ＭＳ 明朝" w:cs="" w:ascii="Aptos" w:hAnsi="Aptos"/>
-                <w:kern w:val="0"/>
-                <w:sz w:val="18"/>
-                <w:szCs w:val="22"/>
-                <w:lang w:val="en-US" w:eastAsia="en-US" w:bidi="ar-SA"/>
-              </w:rPr>
-              <w:t>The game should contain a basic main menu.</w:t>
+            <w:vAlign w:val="center"/>
+          </w:tcPr>
+          <w:p>
+            <w:pPr>
+              <w:pStyle w:val="Normal"/>
+              <w:widowControl/>
+              <w:spacing w:before="0" w:after="0"/>
+              <w:jc w:val="start"/>
+              <w:rPr>
+                <w:rFonts w:eastAsia="ＭＳ 明朝" w:cs=""/>
+                <w:kern w:val="0"/>
+                <w:szCs w:val="22"/>
+                <w:lang w:val="en-US" w:eastAsia="en-US" w:bidi="ar-SA"/>
+              </w:rPr>
+            </w:pPr>
+            <w:r>
+              <w:rPr>
+                <w:rFonts w:eastAsia="ＭＳ 明朝" w:cs="" w:ascii="Aptos" w:hAnsi="Aptos"/>
+                <w:kern w:val="0"/>
+                <w:sz w:val="18"/>
+                <w:szCs w:val="22"/>
+                <w:lang w:val="en-US" w:eastAsia="en-US" w:bidi="ar-SA"/>
+              </w:rPr>
+              <w:t>The game should contain variation in asteroid behaviour, durability, speed or appearance.</w:t>
             </w:r>
           </w:p>
         </w:tc>
@@ -2327,7 +2304,6 @@
           <w:tcPr>
             <w:tcW w:w="3264" w:type="dxa"/>
             <w:tcBorders/>
-            <w:shd w:fill="F7F9FC" w:val="clear"/>
             <w:vAlign w:val="center"/>
           </w:tcPr>
           <w:p>
@@ -2364,30 +2340,31 @@
           <w:tcPr>
             <w:tcW w:w="6528" w:type="dxa"/>
             <w:tcBorders/>
-            <w:vAlign w:val="center"/>
-          </w:tcPr>
-          <w:p>
-            <w:pPr>
-              <w:pStyle w:val="Normal"/>
-              <w:widowControl/>
-              <w:spacing w:before="0" w:after="0"/>
-              <w:jc w:val="start"/>
-              <w:rPr>
-                <w:rFonts w:eastAsia="ＭＳ 明朝" w:cs=""/>
-                <w:kern w:val="0"/>
-                <w:szCs w:val="22"/>
-                <w:lang w:val="en-US" w:eastAsia="en-US" w:bidi="ar-SA"/>
-              </w:rPr>
-            </w:pPr>
-            <w:r>
-              <w:rPr>
-                <w:rFonts w:eastAsia="ＭＳ 明朝" w:cs="" w:ascii="Aptos" w:hAnsi="Aptos"/>
-                <w:kern w:val="0"/>
-                <w:sz w:val="18"/>
-                <w:szCs w:val="22"/>
-                <w:lang w:val="en-US" w:eastAsia="en-US" w:bidi="ar-SA"/>
-              </w:rPr>
-              <w:t>The player could unlock additional ships.</w:t>
+            <w:shd w:fill="F7F9FC" w:val="clear"/>
+            <w:vAlign w:val="center"/>
+          </w:tcPr>
+          <w:p>
+            <w:pPr>
+              <w:pStyle w:val="Normal"/>
+              <w:widowControl/>
+              <w:spacing w:before="0" w:after="0"/>
+              <w:jc w:val="start"/>
+              <w:rPr>
+                <w:rFonts w:eastAsia="ＭＳ 明朝" w:cs=""/>
+                <w:kern w:val="0"/>
+                <w:szCs w:val="22"/>
+                <w:lang w:val="en-US" w:eastAsia="en-US" w:bidi="ar-SA"/>
+              </w:rPr>
+            </w:pPr>
+            <w:r>
+              <w:rPr>
+                <w:rFonts w:eastAsia="ＭＳ 明朝" w:cs="" w:ascii="Aptos" w:hAnsi="Aptos"/>
+                <w:kern w:val="0"/>
+                <w:sz w:val="18"/>
+                <w:szCs w:val="22"/>
+                <w:lang w:val="en-US" w:eastAsia="en-US" w:bidi="ar-SA"/>
+              </w:rPr>
+              <w:t>The game should contain a basic main menu.</w:t>
             </w:r>
           </w:p>
         </w:tc>
@@ -2395,30 +2372,31 @@
           <w:tcPr>
             <w:tcW w:w="3264" w:type="dxa"/>
             <w:tcBorders/>
-            <w:vAlign w:val="center"/>
-          </w:tcPr>
-          <w:p>
-            <w:pPr>
-              <w:pStyle w:val="Normal"/>
-              <w:widowControl/>
-              <w:spacing w:before="0" w:after="0"/>
-              <w:jc w:val="start"/>
-              <w:rPr>
-                <w:rFonts w:eastAsia="ＭＳ 明朝" w:cs=""/>
-                <w:kern w:val="0"/>
-                <w:szCs w:val="22"/>
-                <w:lang w:val="en-US" w:eastAsia="en-US" w:bidi="ar-SA"/>
-              </w:rPr>
-            </w:pPr>
-            <w:r>
-              <w:rPr>
-                <w:rFonts w:eastAsia="ＭＳ 明朝" w:cs="" w:ascii="Aptos" w:hAnsi="Aptos"/>
-                <w:kern w:val="0"/>
-                <w:sz w:val="18"/>
-                <w:szCs w:val="22"/>
-                <w:lang w:val="en-US" w:eastAsia="en-US" w:bidi="ar-SA"/>
-              </w:rPr>
-              <w:t>Could</w:t>
+            <w:shd w:fill="F7F9FC" w:val="clear"/>
+            <w:vAlign w:val="center"/>
+          </w:tcPr>
+          <w:p>
+            <w:pPr>
+              <w:pStyle w:val="Normal"/>
+              <w:widowControl/>
+              <w:spacing w:before="0" w:after="0"/>
+              <w:jc w:val="start"/>
+              <w:rPr>
+                <w:rFonts w:eastAsia="ＭＳ 明朝" w:cs=""/>
+                <w:kern w:val="0"/>
+                <w:szCs w:val="22"/>
+                <w:lang w:val="en-US" w:eastAsia="en-US" w:bidi="ar-SA"/>
+              </w:rPr>
+            </w:pPr>
+            <w:r>
+              <w:rPr>
+                <w:rFonts w:eastAsia="ＭＳ 明朝" w:cs="" w:ascii="Aptos" w:hAnsi="Aptos"/>
+                <w:kern w:val="0"/>
+                <w:sz w:val="18"/>
+                <w:szCs w:val="22"/>
+                <w:lang w:val="en-US" w:eastAsia="en-US" w:bidi="ar-SA"/>
+              </w:rPr>
+              <w:t>Should</w:t>
             </w:r>
           </w:p>
         </w:tc>
@@ -2431,31 +2409,30 @@
           <w:tcPr>
             <w:tcW w:w="6528" w:type="dxa"/>
             <w:tcBorders/>
-            <w:shd w:fill="F7F9FC" w:val="clear"/>
-            <w:vAlign w:val="center"/>
-          </w:tcPr>
-          <w:p>
-            <w:pPr>
-              <w:pStyle w:val="Normal"/>
-              <w:widowControl/>
-              <w:spacing w:before="0" w:after="0"/>
-              <w:jc w:val="start"/>
-              <w:rPr>
-                <w:rFonts w:eastAsia="ＭＳ 明朝" w:cs=""/>
-                <w:kern w:val="0"/>
-                <w:szCs w:val="22"/>
-                <w:lang w:val="en-US" w:eastAsia="en-US" w:bidi="ar-SA"/>
-              </w:rPr>
-            </w:pPr>
-            <w:r>
-              <w:rPr>
-                <w:rFonts w:eastAsia="ＭＳ 明朝" w:cs="" w:ascii="Aptos" w:hAnsi="Aptos"/>
-                <w:kern w:val="0"/>
-                <w:sz w:val="18"/>
-                <w:szCs w:val="22"/>
-                <w:lang w:val="en-US" w:eastAsia="en-US" w:bidi="ar-SA"/>
-              </w:rPr>
-              <w:t>Different ships could have different shooting behaviour.</w:t>
+            <w:vAlign w:val="center"/>
+          </w:tcPr>
+          <w:p>
+            <w:pPr>
+              <w:pStyle w:val="Normal"/>
+              <w:widowControl/>
+              <w:spacing w:before="0" w:after="0"/>
+              <w:jc w:val="start"/>
+              <w:rPr>
+                <w:rFonts w:eastAsia="ＭＳ 明朝" w:cs=""/>
+                <w:kern w:val="0"/>
+                <w:szCs w:val="22"/>
+                <w:lang w:val="en-US" w:eastAsia="en-US" w:bidi="ar-SA"/>
+              </w:rPr>
+            </w:pPr>
+            <w:r>
+              <w:rPr>
+                <w:rFonts w:eastAsia="ＭＳ 明朝" w:cs="" w:ascii="Aptos" w:hAnsi="Aptos"/>
+                <w:kern w:val="0"/>
+                <w:sz w:val="18"/>
+                <w:szCs w:val="22"/>
+                <w:lang w:val="en-US" w:eastAsia="en-US" w:bidi="ar-SA"/>
+              </w:rPr>
+              <w:t>The player could unlock additional ships.</w:t>
             </w:r>
           </w:p>
         </w:tc>
@@ -2463,7 +2440,6 @@
           <w:tcPr>
             <w:tcW w:w="3264" w:type="dxa"/>
             <w:tcBorders/>
-            <w:shd w:fill="F7F9FC" w:val="clear"/>
             <w:vAlign w:val="center"/>
           </w:tcPr>
           <w:p>
@@ -2500,30 +2476,31 @@
           <w:tcPr>
             <w:tcW w:w="6528" w:type="dxa"/>
             <w:tcBorders/>
-            <w:vAlign w:val="center"/>
-          </w:tcPr>
-          <w:p>
-            <w:pPr>
-              <w:pStyle w:val="Normal"/>
-              <w:widowControl/>
-              <w:spacing w:before="0" w:after="0"/>
-              <w:jc w:val="start"/>
-              <w:rPr>
-                <w:rFonts w:eastAsia="ＭＳ 明朝" w:cs=""/>
-                <w:kern w:val="0"/>
-                <w:szCs w:val="22"/>
-                <w:lang w:val="en-US" w:eastAsia="en-US" w:bidi="ar-SA"/>
-              </w:rPr>
-            </w:pPr>
-            <w:r>
-              <w:rPr>
-                <w:rFonts w:eastAsia="ＭＳ 明朝" w:cs="" w:ascii="Aptos" w:hAnsi="Aptos"/>
-                <w:kern w:val="0"/>
-                <w:sz w:val="18"/>
-                <w:szCs w:val="22"/>
-                <w:lang w:val="en-US" w:eastAsia="en-US" w:bidi="ar-SA"/>
-              </w:rPr>
-              <w:t>The game could contain music, sound effects and settings for brightness/SFX/music.</w:t>
+            <w:shd w:fill="F7F9FC" w:val="clear"/>
+            <w:vAlign w:val="center"/>
+          </w:tcPr>
+          <w:p>
+            <w:pPr>
+              <w:pStyle w:val="Normal"/>
+              <w:widowControl/>
+              <w:spacing w:before="0" w:after="0"/>
+              <w:jc w:val="start"/>
+              <w:rPr>
+                <w:rFonts w:eastAsia="ＭＳ 明朝" w:cs=""/>
+                <w:kern w:val="0"/>
+                <w:szCs w:val="22"/>
+                <w:lang w:val="en-US" w:eastAsia="en-US" w:bidi="ar-SA"/>
+              </w:rPr>
+            </w:pPr>
+            <w:r>
+              <w:rPr>
+                <w:rFonts w:eastAsia="ＭＳ 明朝" w:cs="" w:ascii="Aptos" w:hAnsi="Aptos"/>
+                <w:kern w:val="0"/>
+                <w:sz w:val="18"/>
+                <w:szCs w:val="22"/>
+                <w:lang w:val="en-US" w:eastAsia="en-US" w:bidi="ar-SA"/>
+              </w:rPr>
+              <w:t>Different ships could have different shooting behaviour.</w:t>
             </w:r>
           </w:p>
         </w:tc>
@@ -2531,6 +2508,7 @@
           <w:tcPr>
             <w:tcW w:w="3264" w:type="dxa"/>
             <w:tcBorders/>
+            <w:shd w:fill="F7F9FC" w:val="clear"/>
             <w:vAlign w:val="center"/>
           </w:tcPr>
           <w:p>
@@ -2567,6 +2545,73 @@
           <w:tcPr>
             <w:tcW w:w="6528" w:type="dxa"/>
             <w:tcBorders/>
+            <w:vAlign w:val="center"/>
+          </w:tcPr>
+          <w:p>
+            <w:pPr>
+              <w:pStyle w:val="Normal"/>
+              <w:widowControl/>
+              <w:spacing w:before="0" w:after="0"/>
+              <w:jc w:val="start"/>
+              <w:rPr>
+                <w:rFonts w:eastAsia="ＭＳ 明朝" w:cs=""/>
+                <w:kern w:val="0"/>
+                <w:szCs w:val="22"/>
+                <w:lang w:val="en-US" w:eastAsia="en-US" w:bidi="ar-SA"/>
+              </w:rPr>
+            </w:pPr>
+            <w:r>
+              <w:rPr>
+                <w:rFonts w:eastAsia="ＭＳ 明朝" w:cs="" w:ascii="Aptos" w:hAnsi="Aptos"/>
+                <w:kern w:val="0"/>
+                <w:sz w:val="18"/>
+                <w:szCs w:val="22"/>
+                <w:lang w:val="en-US" w:eastAsia="en-US" w:bidi="ar-SA"/>
+              </w:rPr>
+              <w:t>The game could contain music, sound effects and settings for brightness/SFX/music.</w:t>
+            </w:r>
+          </w:p>
+        </w:tc>
+        <w:tc>
+          <w:tcPr>
+            <w:tcW w:w="3264" w:type="dxa"/>
+            <w:tcBorders/>
+            <w:vAlign w:val="center"/>
+          </w:tcPr>
+          <w:p>
+            <w:pPr>
+              <w:pStyle w:val="Normal"/>
+              <w:widowControl/>
+              <w:spacing w:before="0" w:after="0"/>
+              <w:jc w:val="start"/>
+              <w:rPr>
+                <w:rFonts w:eastAsia="ＭＳ 明朝" w:cs=""/>
+                <w:kern w:val="0"/>
+                <w:szCs w:val="22"/>
+                <w:lang w:val="en-US" w:eastAsia="en-US" w:bidi="ar-SA"/>
+              </w:rPr>
+            </w:pPr>
+            <w:r>
+              <w:rPr>
+                <w:rFonts w:eastAsia="ＭＳ 明朝" w:cs="" w:ascii="Aptos" w:hAnsi="Aptos"/>
+                <w:kern w:val="0"/>
+                <w:sz w:val="18"/>
+                <w:szCs w:val="22"/>
+                <w:lang w:val="en-US" w:eastAsia="en-US" w:bidi="ar-SA"/>
+              </w:rPr>
+              <w:t>Could</w:t>
+            </w:r>
+          </w:p>
+        </w:tc>
+      </w:tr>
+      <w:tr>
+        <w:trPr>
+          <w:cantSplit/>
+        </w:trPr>
+        <w:tc>
+          <w:tcPr>
+            <w:tcW w:w="6528" w:type="dxa"/>
+            <w:tcBorders/>
             <w:shd w:fill="F7F9FC" w:val="clear"/>
             <w:vAlign w:val="center"/>
           </w:tcPr>
@@ -2591,28 +2636,7 @@
                 <w:szCs w:val="22"/>
                 <w:lang w:val="en-US" w:eastAsia="en-US" w:bidi="ar-SA"/>
               </w:rPr>
-              <w:t xml:space="preserve">The project will </w:t>
-            </w:r>
-            <w:r>
-              <w:rPr>
-                <w:rFonts w:eastAsia="ＭＳ 明朝" w:cs="" w:ascii="Aptos" w:hAnsi="Aptos"/>
-                <w:kern w:val="0"/>
-                <w:sz w:val="18"/>
-                <w:szCs w:val="22"/>
-                <w:u w:val="single"/>
-                <w:lang w:val="en-US" w:eastAsia="en-US" w:bidi="ar-SA"/>
-              </w:rPr>
-              <w:t xml:space="preserve">not </w:t>
-            </w:r>
-            <w:r>
-              <w:rPr>
-                <w:rFonts w:eastAsia="ＭＳ 明朝" w:cs="" w:ascii="Aptos" w:hAnsi="Aptos"/>
-                <w:kern w:val="0"/>
-                <w:sz w:val="18"/>
-                <w:szCs w:val="22"/>
-                <w:lang w:val="en-US" w:eastAsia="en-US" w:bidi="ar-SA"/>
-              </w:rPr>
-              <w:t>include multiplayer functionality.</w:t>
+              <w:t>The project will include multiplayer functionality.</w:t>
             </w:r>
           </w:p>
         </w:tc>
@@ -2991,10 +3015,73 @@
         <w:t>Another recommendation is distributing the game as a compiled release.</w:t>
       </w:r>
     </w:p>
+    <w:p>
+      <w:pPr>
+        <w:pStyle w:val="Normal"/>
+        <w:rPr/>
+      </w:pPr>
+      <w:r>
+        <w:rPr/>
+      </w:r>
+    </w:p>
+    <w:p>
+      <w:pPr>
+        <w:pStyle w:val="Normal"/>
+        <w:rPr/>
+      </w:pPr>
+      <w:r>
+        <w:rPr/>
+      </w:r>
+    </w:p>
+    <w:p>
+      <w:pPr>
+        <w:pStyle w:val="Normal"/>
+        <w:rPr/>
+      </w:pPr>
+      <w:r>
+        <w:rPr/>
+      </w:r>
+    </w:p>
+    <w:p>
+      <w:pPr>
+        <w:pStyle w:val="Heading1"/>
+        <w:rPr/>
+      </w:pPr>
+      <w:bookmarkStart w:id="13" w:name="__RefHeading___Toc389_2130912753"/>
+      <w:bookmarkEnd w:id="13"/>
+      <w:r>
+        <w:rPr/>
+        <w:t>7. Technical Details</w:t>
+        <w:br/>
+      </w:r>
+    </w:p>
+    <w:p>
+      <w:pPr>
+        <w:pStyle w:val="Normal"/>
+        <w:rPr/>
+      </w:pPr>
+      <w:r>
+        <w:rPr/>
+        <w:t>Technical details such as comparisons between technologies and reasons for specific technical choices are written in the “</w:t>
+      </w:r>
+      <w:hyperlink r:id="rId3">
+        <w:r>
+          <w:rPr>
+            <w:rStyle w:val="Hyperlink"/>
+            <w:u w:val="none"/>
+          </w:rPr>
+          <w:t>Technical Details</w:t>
+        </w:r>
+      </w:hyperlink>
+      <w:r>
+        <w:rPr/>
+        <w:t>” Document.</w:t>
+      </w:r>
+    </w:p>
     <w:sectPr>
-      <w:footerReference w:type="even" r:id="rId3"/>
-      <w:footerReference w:type="default" r:id="rId4"/>
-      <w:footerReference w:type="first" r:id="rId5"/>
+      <w:footerReference w:type="even" r:id="rId4"/>
+      <w:footerReference w:type="default" r:id="rId5"/>
+      <w:footerReference w:type="first" r:id="rId6"/>
       <w:type w:val="nextPage"/>
       <w:pgSz w:w="12240" w:h="15840"/>
       <w:pgMar w:left="1134" w:right="1134" w:gutter="0" w:header="0" w:top="1134" w:footer="1134" w:bottom="1693"/>
@@ -3029,40 +3116,6 @@
       <w:jc w:val="center"/>
       <w:rPr/>
     </w:pPr>
-    <w:bookmarkStart w:id="13" w:name="PageNumWizard_FOOTER_Default_Page_Style1"/>
-    <w:r>
-      <w:rPr/>
-      <w:fldChar w:fldCharType="begin"/>
-    </w:r>
-    <w:r>
-      <w:rPr/>
-      <w:instrText xml:space="preserve"> PAGE </w:instrText>
-    </w:r>
-    <w:r>
-      <w:rPr/>
-      <w:fldChar w:fldCharType="separate"/>
-    </w:r>
-    <w:r>
-      <w:rPr/>
-      <w:t>5</w:t>
-    </w:r>
-    <w:r>
-      <w:rPr/>
-      <w:fldChar w:fldCharType="end"/>
-    </w:r>
-    <w:bookmarkEnd w:id="13"/>
-  </w:p>
-</w:ftr>
-</file>
-
-<file path=word/footer3.xml><?xml version="1.0" encoding="utf-8"?>
-<w:ftr xmlns:o="urn:schemas-microsoft-com:office:office" xmlns:r="http://schemas.openxmlformats.org/officeDocument/2006/relationships" xmlns:v="urn:schemas-microsoft-com:vml" xmlns:w="http://schemas.openxmlformats.org/wordprocessingml/2006/main" xmlns:w10="urn:schemas-microsoft-com:office:word" xmlns:wp="http://schemas.openxmlformats.org/drawingml/2006/wordprocessingDrawing" xmlns:pic="http://schemas.openxmlformats.org/drawingml/2006/picture" xmlns:wps="http://schemas.microsoft.com/office/word/2010/wordprocessingShape" xmlns:wpg="http://schemas.microsoft.com/office/word/2010/wordprocessingGroup" xmlns:mc="http://schemas.openxmlformats.org/markup-compatibility/2006" xmlns:wp14="http://schemas.microsoft.com/office/word/2010/wordprocessingDrawing" xmlns:w14="http://schemas.microsoft.com/office/word/2010/wordml" xmlns:w15="http://schemas.microsoft.com/office/word/2012/wordml" mc:Ignorable="w14 wp14 w15">
-  <w:p>
-    <w:pPr>
-      <w:pStyle w:val="Footer"/>
-      <w:jc w:val="center"/>
-      <w:rPr/>
-    </w:pPr>
     <w:bookmarkStart w:id="14" w:name="PageNumWizard_FOOTER_Default_Page_Style1"/>
     <w:r>
       <w:rPr/>
@@ -3085,6 +3138,40 @@
       <w:fldChar w:fldCharType="end"/>
     </w:r>
     <w:bookmarkEnd w:id="14"/>
+  </w:p>
+</w:ftr>
+</file>
+
+<file path=word/footer3.xml><?xml version="1.0" encoding="utf-8"?>
+<w:ftr xmlns:o="urn:schemas-microsoft-com:office:office" xmlns:r="http://schemas.openxmlformats.org/officeDocument/2006/relationships" xmlns:v="urn:schemas-microsoft-com:vml" xmlns:w="http://schemas.openxmlformats.org/wordprocessingml/2006/main" xmlns:w10="urn:schemas-microsoft-com:office:word" xmlns:wp="http://schemas.openxmlformats.org/drawingml/2006/wordprocessingDrawing" xmlns:pic="http://schemas.openxmlformats.org/drawingml/2006/picture" xmlns:wps="http://schemas.microsoft.com/office/word/2010/wordprocessingShape" xmlns:wpg="http://schemas.microsoft.com/office/word/2010/wordprocessingGroup" xmlns:mc="http://schemas.openxmlformats.org/markup-compatibility/2006" xmlns:wp14="http://schemas.microsoft.com/office/word/2010/wordprocessingDrawing" xmlns:w14="http://schemas.microsoft.com/office/word/2010/wordml" xmlns:w15="http://schemas.microsoft.com/office/word/2012/wordml" mc:Ignorable="w14 wp14 w15">
+  <w:p>
+    <w:pPr>
+      <w:pStyle w:val="Footer"/>
+      <w:jc w:val="center"/>
+      <w:rPr/>
+    </w:pPr>
+    <w:bookmarkStart w:id="15" w:name="PageNumWizard_FOOTER_Default_Page_Style1"/>
+    <w:r>
+      <w:rPr/>
+      <w:fldChar w:fldCharType="begin"/>
+    </w:r>
+    <w:r>
+      <w:rPr/>
+      <w:instrText xml:space="preserve"> PAGE </w:instrText>
+    </w:r>
+    <w:r>
+      <w:rPr/>
+      <w:fldChar w:fldCharType="separate"/>
+    </w:r>
+    <w:r>
+      <w:rPr/>
+      <w:t>5</w:t>
+    </w:r>
+    <w:r>
+      <w:rPr/>
+      <w:fldChar w:fldCharType="end"/>
+    </w:r>
+    <w:bookmarkEnd w:id="15"/>
   </w:p>
 </w:ftr>
 </file>
@@ -3552,6 +3639,13 @@
     <w:name w:val="Index Link"/>
     <w:qFormat/>
     <w:rPr/>
+  </w:style>
+  <w:style w:type="character" w:styleId="FollowedHyperlink">
+    <w:name w:val="FollowedHyperlink"/>
+    <w:rPr>
+      <w:color w:val="800000"/>
+      <w:u w:val="single"/>
+    </w:rPr>
   </w:style>
   <w:style w:type="paragraph" w:styleId="Heading">
     <w:name w:val="Heading"/>
@@ -3758,6 +3852,13 @@
     </w:pPr>
     <w:rPr/>
   </w:style>
+  <w:style w:type="paragraph" w:styleId="FrameContents">
+    <w:name w:val="Frame Contents"/>
+    <w:basedOn w:val="Normal"/>
+    <w:qFormat/>
+    <w:pPr/>
+    <w:rPr/>
+  </w:style>
 </w:styles>
 </file>
 

</xml_diff>

<commit_message>
Added directional shooting, removed unnecesary fields for widht and height, made the tehcnical details doc, expanded the design pptx
</commit_message>
<xml_diff>
--- a/doc/analysis/analysis.docx
+++ b/doc/analysis/analysis.docx
@@ -3852,8 +3852,8 @@
     </w:pPr>
     <w:rPr/>
   </w:style>
-  <w:style w:type="paragraph" w:styleId="FrameContents">
-    <w:name w:val="Frame Contents"/>
+  <w:style w:type="paragraph" w:styleId="FrameContentsuser">
+    <w:name w:val="Frame Contents (user)"/>
     <w:basedOn w:val="Normal"/>
     <w:qFormat/>
     <w:pPr/>

</xml_diff>

<commit_message>
Added a game menu state, but i have to draw what i want on the menu. Added 2 game modes - hard and easy, which would be made changeable in the game menu
</commit_message>
<xml_diff>
--- a/doc/analysis/analysis.docx
+++ b/doc/analysis/analysis.docx
@@ -2462,6 +2462,88 @@
                 <w:sz w:val="18"/>
                 <w:szCs w:val="22"/>
                 <w:lang w:val="en-US" w:eastAsia="en-US" w:bidi="ar-SA"/>
+              </w:rPr>
+              <w:t>Could</w:t>
+            </w:r>
+          </w:p>
+        </w:tc>
+      </w:tr>
+      <w:tr>
+        <w:trPr>
+          <w:cantSplit/>
+        </w:trPr>
+        <w:tc>
+          <w:tcPr>
+            <w:tcW w:w="6528" w:type="dxa"/>
+            <w:tcBorders/>
+            <w:vAlign w:val="center"/>
+          </w:tcPr>
+          <w:p>
+            <w:pPr>
+              <w:pStyle w:val="Normal"/>
+              <w:widowControl/>
+              <w:spacing w:before="0" w:after="0"/>
+              <w:jc w:val="start"/>
+              <w:rPr>
+                <w:rFonts w:eastAsia="ＭＳ 明朝" w:cs=""/>
+                <w:kern w:val="0"/>
+                <w:szCs w:val="22"/>
+                <w:lang w:val="en-US" w:eastAsia="en-US" w:bidi="ar-SA"/>
+              </w:rPr>
+            </w:pPr>
+            <w:r>
+              <w:rPr>
+                <w:rFonts w:ascii="Aptos" w:hAnsi="Aptos"/>
+                <w:sz w:val="18"/>
+              </w:rPr>
+              <w:t xml:space="preserve">The </w:t>
+            </w:r>
+            <w:r>
+              <w:rPr>
+                <w:rFonts w:ascii="Aptos" w:hAnsi="Aptos"/>
+                <w:sz w:val="18"/>
+              </w:rPr>
+              <w:t>game</w:t>
+            </w:r>
+            <w:r>
+              <w:rPr>
+                <w:rFonts w:ascii="Aptos" w:hAnsi="Aptos"/>
+                <w:sz w:val="18"/>
+              </w:rPr>
+              <w:t xml:space="preserve"> could </w:t>
+            </w:r>
+            <w:r>
+              <w:rPr>
+                <w:rFonts w:ascii="Aptos" w:hAnsi="Aptos"/>
+                <w:sz w:val="18"/>
+              </w:rPr>
+              <w:t>have different game modes.</w:t>
+            </w:r>
+          </w:p>
+        </w:tc>
+        <w:tc>
+          <w:tcPr>
+            <w:tcW w:w="3264" w:type="dxa"/>
+            <w:tcBorders/>
+            <w:vAlign w:val="center"/>
+          </w:tcPr>
+          <w:p>
+            <w:pPr>
+              <w:pStyle w:val="Normal"/>
+              <w:widowControl/>
+              <w:spacing w:before="0" w:after="0"/>
+              <w:jc w:val="start"/>
+              <w:rPr>
+                <w:rFonts w:eastAsia="ＭＳ 明朝" w:cs=""/>
+                <w:kern w:val="0"/>
+                <w:szCs w:val="22"/>
+                <w:lang w:val="en-US" w:eastAsia="en-US" w:bidi="ar-SA"/>
+              </w:rPr>
+            </w:pPr>
+            <w:r>
+              <w:rPr>
+                <w:rFonts w:ascii="Aptos" w:hAnsi="Aptos"/>
+                <w:sz w:val="18"/>
               </w:rPr>
               <w:t>Could</w:t>
             </w:r>
@@ -3852,8 +3934,8 @@
     </w:pPr>
     <w:rPr/>
   </w:style>
-  <w:style w:type="paragraph" w:styleId="FrameContentsuser">
-    <w:name w:val="Frame Contents (user)"/>
+  <w:style w:type="paragraph" w:styleId="FrameContents">
+    <w:name w:val="Frame Contents"/>
     <w:basedOn w:val="Normal"/>
     <w:qFormat/>
     <w:pPr/>

</xml_diff>

<commit_message>
Added shield power-up, improved collisions, and polished game menus
</commit_message>
<xml_diff>
--- a/doc/analysis/analysis.docx
+++ b/doc/analysis/analysis.docx
@@ -1693,7 +1693,7 @@
                 <w:szCs w:val="22"/>
                 <w:lang w:val="en-US" w:eastAsia="en-US" w:bidi="ar-SA"/>
               </w:rPr>
-              <w:t>The player must be able to fire projectiles.</w:t>
+              <w:t>The player must be able to fire projectiles</w:t>
             </w:r>
           </w:p>
         </w:tc>
@@ -1761,7 +1761,7 @@
                 <w:szCs w:val="22"/>
                 <w:lang w:val="en-US" w:eastAsia="en-US" w:bidi="ar-SA"/>
               </w:rPr>
-              <w:t>Projectiles must be able to destroy asteroids when they collide.</w:t>
+              <w:t>Projectiles must be able to destroy asteroids when they collide</w:t>
             </w:r>
           </w:p>
         </w:tc>
@@ -1895,7 +1895,17 @@
                 <w:szCs w:val="22"/>
                 <w:lang w:val="en-US" w:eastAsia="en-US" w:bidi="ar-SA"/>
               </w:rPr>
-              <w:t>The game must end when the player is hit by an asteroid.</w:t>
+              <w:t xml:space="preserve">The game must end when the player is hit by an asteroid. </w:t>
+            </w:r>
+            <w:r>
+              <w:rPr>
+                <w:rFonts w:eastAsia="ＭＳ 明朝" w:cs="" w:ascii="Aptos" w:hAnsi="Aptos"/>
+                <w:kern w:val="0"/>
+                <w:sz w:val="18"/>
+                <w:szCs w:val="22"/>
+                <w:lang w:val="en-US" w:eastAsia="en-US" w:bidi="ar-SA"/>
+              </w:rPr>
+              <w:t>Unless there is an active shield</w:t>
             </w:r>
           </w:p>
         </w:tc>
@@ -1963,7 +1973,7 @@
                 <w:szCs w:val="22"/>
                 <w:lang w:val="en-US" w:eastAsia="en-US" w:bidi="ar-SA"/>
               </w:rPr>
-              <w:t>The player must be able to restart after losing.</w:t>
+              <w:t>The player must be able to restart after losing</w:t>
             </w:r>
           </w:p>
         </w:tc>
@@ -2031,7 +2041,7 @@
                 <w:szCs w:val="22"/>
                 <w:lang w:val="en-US" w:eastAsia="en-US" w:bidi="ar-SA"/>
               </w:rPr>
-              <w:t>The game must track and display the player's score.</w:t>
+              <w:t>The game must track and display the player's score</w:t>
             </w:r>
           </w:p>
         </w:tc>
@@ -2099,7 +2109,7 @@
                 <w:szCs w:val="22"/>
                 <w:lang w:val="en-US" w:eastAsia="en-US" w:bidi="ar-SA"/>
               </w:rPr>
-              <w:t>Asteroids should become faster when the socre is higher.</w:t>
+              <w:t>Asteroids should become faster when the socre is higher</w:t>
             </w:r>
           </w:p>
         </w:tc>
@@ -2228,7 +2238,7 @@
                 <w:szCs w:val="22"/>
                 <w:lang w:val="en-US" w:eastAsia="en-US" w:bidi="ar-SA"/>
               </w:rPr>
-              <w:t>Temporary upgrades or rewards should appear during gameplay.</w:t>
+              <w:t>Temporary upgrades or rewards should appear during gameplay</w:t>
             </w:r>
           </w:p>
         </w:tc>
@@ -2296,7 +2306,7 @@
                 <w:szCs w:val="22"/>
                 <w:lang w:val="en-US" w:eastAsia="en-US" w:bidi="ar-SA"/>
               </w:rPr>
-              <w:t>The game should contain variation in asteroid behaviour, durability, speed or appearance.</w:t>
+              <w:t>The game should have different game modes</w:t>
             </w:r>
           </w:p>
         </w:tc>
@@ -2364,7 +2374,27 @@
                 <w:szCs w:val="22"/>
                 <w:lang w:val="en-US" w:eastAsia="en-US" w:bidi="ar-SA"/>
               </w:rPr>
-              <w:t>The game should contain a basic main menu.</w:t>
+              <w:t>The game should contain a basic main/</w:t>
+            </w:r>
+            <w:r>
+              <w:rPr>
+                <w:rFonts w:eastAsia="ＭＳ 明朝" w:cs="" w:ascii="Aptos" w:hAnsi="Aptos"/>
+                <w:kern w:val="0"/>
+                <w:sz w:val="18"/>
+                <w:szCs w:val="22"/>
+                <w:lang w:val="en-US" w:eastAsia="en-US" w:bidi="ar-SA"/>
+              </w:rPr>
+              <w:t xml:space="preserve">pause </w:t>
+            </w:r>
+            <w:r>
+              <w:rPr>
+                <w:rFonts w:eastAsia="ＭＳ 明朝" w:cs="" w:ascii="Aptos" w:hAnsi="Aptos"/>
+                <w:kern w:val="0"/>
+                <w:sz w:val="18"/>
+                <w:szCs w:val="22"/>
+                <w:lang w:val="en-US" w:eastAsia="en-US" w:bidi="ar-SA"/>
+              </w:rPr>
+              <w:t>menu</w:t>
             </w:r>
           </w:p>
         </w:tc>
@@ -2496,28 +2526,7 @@
                 <w:rFonts w:ascii="Aptos" w:hAnsi="Aptos"/>
                 <w:sz w:val="18"/>
               </w:rPr>
-              <w:t xml:space="preserve">The </w:t>
-            </w:r>
-            <w:r>
-              <w:rPr>
-                <w:rFonts w:ascii="Aptos" w:hAnsi="Aptos"/>
-                <w:sz w:val="18"/>
-              </w:rPr>
-              <w:t>game</w:t>
-            </w:r>
-            <w:r>
-              <w:rPr>
-                <w:rFonts w:ascii="Aptos" w:hAnsi="Aptos"/>
-                <w:sz w:val="18"/>
-              </w:rPr>
-              <w:t xml:space="preserve"> could </w:t>
-            </w:r>
-            <w:r>
-              <w:rPr>
-                <w:rFonts w:ascii="Aptos" w:hAnsi="Aptos"/>
-                <w:sz w:val="18"/>
-              </w:rPr>
-              <w:t>have different game modes.</w:t>
+              <w:t>The game could contain variation in asteroid behaviour, durability, speed or appearance.</w:t>
             </w:r>
           </w:p>
         </w:tc>
@@ -2718,7 +2727,27 @@
                 <w:szCs w:val="22"/>
                 <w:lang w:val="en-US" w:eastAsia="en-US" w:bidi="ar-SA"/>
               </w:rPr>
-              <w:t>The project will include multiplayer functionality.</w:t>
+              <w:t>The project w</w:t>
+            </w:r>
+            <w:r>
+              <w:rPr>
+                <w:rFonts w:eastAsia="ＭＳ 明朝" w:cs="" w:ascii="Aptos" w:hAnsi="Aptos"/>
+                <w:kern w:val="0"/>
+                <w:sz w:val="18"/>
+                <w:szCs w:val="22"/>
+                <w:lang w:val="en-US" w:eastAsia="en-US" w:bidi="ar-SA"/>
+              </w:rPr>
+              <w:t xml:space="preserve">on’t </w:t>
+            </w:r>
+            <w:r>
+              <w:rPr>
+                <w:rFonts w:eastAsia="ＭＳ 明朝" w:cs="" w:ascii="Aptos" w:hAnsi="Aptos"/>
+                <w:kern w:val="0"/>
+                <w:sz w:val="18"/>
+                <w:szCs w:val="22"/>
+                <w:lang w:val="en-US" w:eastAsia="en-US" w:bidi="ar-SA"/>
+              </w:rPr>
+              <w:t>include multiplayer functionality.</w:t>
             </w:r>
           </w:p>
         </w:tc>

</xml_diff>